<commit_message>
features : contour/phrase/rhythm, tension, swing/chordscale
</commit_message>
<xml_diff>
--- a/docs/AUDIT_Music_Academy_2026-07-30.docx
+++ b/docs/AUDIT_Music_Academy_2026-07-30.docx
@@ -14233,10 +14233,14 @@
           <w:p>
             <w:pPr>
               <w:spacing w:after="40" w:line="260" w:lineRule="auto"/>
+              <w:rPr>
+                <w:strike/>
+              </w:rPr>
             </w:pPr>
             <w:proofErr w:type="gramStart"/>
             <w:r>
               <w:rPr>
+                <w:strike/>
                 <w:sz w:val="20"/>
                 <w:szCs w:val="20"/>
               </w:rPr>
@@ -14245,6 +14249,7 @@
             <w:proofErr w:type="gramEnd"/>
             <w:r>
               <w:rPr>
+                <w:strike/>
                 <w:sz w:val="20"/>
                 <w:szCs w:val="20"/>
               </w:rPr>
@@ -14253,6 +14258,7 @@
             <w:proofErr w:type="spellStart"/>
             <w:r>
               <w:rPr>
+                <w:strike/>
                 <w:sz w:val="20"/>
                 <w:szCs w:val="20"/>
               </w:rPr>
@@ -14261,6 +14267,7 @@
             <w:proofErr w:type="spellEnd"/>
             <w:r>
               <w:rPr>
+                <w:strike/>
                 <w:sz w:val="20"/>
                 <w:szCs w:val="20"/>
               </w:rPr>
@@ -14380,10 +14387,14 @@
           <w:p>
             <w:pPr>
               <w:spacing w:after="40" w:line="260" w:lineRule="auto"/>
+              <w:rPr>
+                <w:strike/>
+              </w:rPr>
             </w:pPr>
             <w:proofErr w:type="gramStart"/>
             <w:r>
               <w:rPr>
+                <w:strike/>
                 <w:sz w:val="20"/>
                 <w:szCs w:val="20"/>
               </w:rPr>
@@ -14392,6 +14403,7 @@
             <w:proofErr w:type="gramEnd"/>
             <w:r>
               <w:rPr>
+                <w:strike/>
                 <w:sz w:val="20"/>
                 <w:szCs w:val="20"/>
               </w:rPr>
@@ -14400,6 +14412,7 @@
             <w:proofErr w:type="spellStart"/>
             <w:r>
               <w:rPr>
+                <w:strike/>
                 <w:sz w:val="20"/>
                 <w:szCs w:val="20"/>
               </w:rPr>
@@ -14408,6 +14421,7 @@
             <w:proofErr w:type="spellEnd"/>
             <w:r>
               <w:rPr>
+                <w:strike/>
                 <w:sz w:val="20"/>
                 <w:szCs w:val="20"/>
               </w:rPr>
@@ -14416,6 +14430,7 @@
             <w:proofErr w:type="spellStart"/>
             <w:r>
               <w:rPr>
+                <w:strike/>
                 <w:sz w:val="20"/>
                 <w:szCs w:val="20"/>
               </w:rPr>

</xml_diff>